<commit_message>
test 1 topic modelling LDA
</commit_message>
<xml_diff>
--- a/notes.docx
+++ b/notes.docx
@@ -61,11 +61,113 @@
       </w:r>
     </w:p>
     <w:p>
+      <w:pPr>
+        <w:pStyle w:val="ListParagraph"/>
+        <w:numPr>
+          <w:ilvl w:val="0"/>
+          <w:numId w:val="4"/>
+        </w:numPr>
+        <w:rPr>
+          <w:lang w:val="pt-BR"/>
+        </w:rPr>
+      </w:pPr>
+      <w:r>
+        <w:rPr>
+          <w:lang w:val="pt-BR"/>
+        </w:rPr>
+        <w:t>Minimnya pemahaman tentang hubungan antara topik, se</w:t>
+      </w:r>
+      <w:r>
+        <w:rPr>
+          <w:lang w:val="pt-BR"/>
+        </w:rPr>
+        <w:t>ntimen, dan emosi pengguna</w:t>
+      </w:r>
+    </w:p>
+    <w:p>
+      <w:pPr>
+        <w:pStyle w:val="ListParagraph"/>
+        <w:numPr>
+          <w:ilvl w:val="0"/>
+          <w:numId w:val="4"/>
+        </w:numPr>
+      </w:pPr>
+      <w:r>
+        <w:t>Kurangnya sistem monitoring real-time</w:t>
+      </w:r>
+      <w:r>
+        <w:t xml:space="preserve"> untuk menagkap perubahan opini pengguna terkait fitur baru atau update aplikasi</w:t>
+      </w:r>
+    </w:p>
+    <w:p>
       <w:r>
         <w:t>Batasan masalah:</w:t>
       </w:r>
     </w:p>
     <w:p>
+      <w:pPr>
+        <w:pStyle w:val="ListParagraph"/>
+        <w:numPr>
+          <w:ilvl w:val="0"/>
+          <w:numId w:val="4"/>
+        </w:numPr>
+      </w:pPr>
+      <w:r>
+        <w:t>Data yang diambil dari ulasan playstore (bahasa indonesia dan in</w:t>
+      </w:r>
+      <w:r>
+        <w:t>ggris)</w:t>
+      </w:r>
+    </w:p>
+    <w:p>
+      <w:pPr>
+        <w:pStyle w:val="ListParagraph"/>
+        <w:numPr>
+          <w:ilvl w:val="0"/>
+          <w:numId w:val="4"/>
+        </w:numPr>
+        <w:rPr>
+          <w:lang w:val="pt-BR"/>
+        </w:rPr>
+      </w:pPr>
+      <w:r>
+        <w:rPr>
+          <w:lang w:val="pt-BR"/>
+        </w:rPr>
+        <w:t>Analisis topik dobatasi  pada 3-5 topi</w:t>
+      </w:r>
+      <w:r>
+        <w:rPr>
+          <w:lang w:val="pt-BR"/>
+        </w:rPr>
+        <w:t>k</w:t>
+      </w:r>
+    </w:p>
+    <w:p>
+      <w:pPr>
+        <w:pStyle w:val="ListParagraph"/>
+        <w:numPr>
+          <w:ilvl w:val="0"/>
+          <w:numId w:val="4"/>
+        </w:numPr>
+      </w:pPr>
+      <w:r>
+        <w:t>Sentimen diklasifikasikan negatif, positif, netral</w:t>
+      </w:r>
+    </w:p>
+    <w:p>
+      <w:pPr>
+        <w:pStyle w:val="ListParagraph"/>
+        <w:numPr>
+          <w:ilvl w:val="0"/>
+          <w:numId w:val="4"/>
+        </w:numPr>
+      </w:pPr>
+      <w:r>
+        <w:t>Emosi yg digunakan menjadi …. kategori</w:t>
+      </w:r>
+    </w:p>
+    <w:p>
       <w:r>
         <w:t>Rumusan masalah</w:t>
       </w:r>
@@ -74,9 +176,90 @@
       </w:r>
     </w:p>
     <w:p>
+      <w:pPr>
+        <w:pStyle w:val="ListParagraph"/>
+        <w:numPr>
+          <w:ilvl w:val="0"/>
+          <w:numId w:val="4"/>
+        </w:numPr>
+        <w:rPr>
+          <w:lang w:val="pt-BR"/>
+        </w:rPr>
+      </w:pPr>
+      <w:r>
+        <w:rPr>
+          <w:lang w:val="pt-BR"/>
+        </w:rPr>
+        <w:t>Topik apa saja yang dibahas dalam</w:t>
+      </w:r>
+      <w:r>
+        <w:rPr>
+          <w:lang w:val="pt-BR"/>
+        </w:rPr>
+        <w:t xml:space="preserve"> komentar pengguna</w:t>
+      </w:r>
+    </w:p>
+    <w:p>
+      <w:pPr>
+        <w:pStyle w:val="ListParagraph"/>
+        <w:numPr>
+          <w:ilvl w:val="0"/>
+          <w:numId w:val="4"/>
+        </w:numPr>
+        <w:rPr>
+          <w:lang w:val="pt-BR"/>
+        </w:rPr>
+      </w:pPr>
+      <w:r>
+        <w:rPr>
+          <w:lang w:val="pt-BR"/>
+        </w:rPr>
+        <w:t>Bagaimana distribusi sentimen pada masing2 topik</w:t>
+      </w:r>
+    </w:p>
+    <w:p>
+      <w:pPr>
+        <w:pStyle w:val="ListParagraph"/>
+        <w:numPr>
+          <w:ilvl w:val="0"/>
+          <w:numId w:val="4"/>
+        </w:numPr>
+      </w:pPr>
+      <w:r>
+        <w:t>Apakah terdapat pola korelasi tertentu dengan sen</w:t>
+      </w:r>
+      <w:r>
+        <w:t>timen?</w:t>
+      </w:r>
+    </w:p>
+    <w:p>
+      <w:pPr>
+        <w:pStyle w:val="ListParagraph"/>
+        <w:numPr>
+          <w:ilvl w:val="0"/>
+          <w:numId w:val="4"/>
+        </w:numPr>
+      </w:pPr>
+      <w:r>
+        <w:t>Bagaimana memvisualisasikan hasil analisis ini dalam dashboard in</w:t>
+      </w:r>
+      <w:r>
+        <w:t>teraktif</w:t>
+      </w:r>
+    </w:p>
+    <w:p>
       <w:r>
         <w:t>Tujuan Penelitian:</w:t>
       </w:r>
+    </w:p>
+    <w:p>
+      <w:pPr>
+        <w:pStyle w:val="ListParagraph"/>
+        <w:numPr>
+          <w:ilvl w:val="0"/>
+          <w:numId w:val="4"/>
+        </w:numPr>
+      </w:pPr>
     </w:p>
     <w:p>
       <w:r>
@@ -252,6 +435,7 @@
     <w:p/>
     <w:p>
       <w:r>
+        <w:lastRenderedPageBreak/>
         <w:t xml:space="preserve">Output: </w:t>
       </w:r>
     </w:p>

</xml_diff>

<commit_message>
update + emotion analysis
</commit_message>
<xml_diff>
--- a/notes.docx
+++ b/notes.docx
@@ -198,6 +198,12 @@
         </w:rPr>
         <w:t xml:space="preserve"> komentar pengguna</w:t>
       </w:r>
+      <w:r>
+        <w:rPr>
+          <w:lang w:val="pt-BR"/>
+        </w:rPr>
+        <w:t>?</w:t>
+      </w:r>
     </w:p>
     <w:p>
       <w:pPr>
@@ -216,6 +222,12 @@
         </w:rPr>
         <w:t>Bagaimana distribusi sentimen pada masing2 topik</w:t>
       </w:r>
+      <w:r>
+        <w:rPr>
+          <w:lang w:val="pt-BR"/>
+        </w:rPr>
+        <w:t>?</w:t>
+      </w:r>
     </w:p>
     <w:p>
       <w:pPr>
@@ -246,6 +258,9 @@
       <w:r>
         <w:t>teraktif</w:t>
       </w:r>
+      <w:r>
+        <w:t>?</w:t>
+      </w:r>
     </w:p>
     <w:p>
       <w:r>
@@ -259,7 +274,103 @@
           <w:ilvl w:val="0"/>
           <w:numId w:val="4"/>
         </w:numPr>
-      </w:pPr>
+        <w:rPr>
+          <w:lang w:val="pt-BR"/>
+        </w:rPr>
+      </w:pPr>
+      <w:r>
+        <w:rPr>
+          <w:lang w:val="pt-BR"/>
+        </w:rPr>
+        <w:t xml:space="preserve">Melihat </w:t>
+      </w:r>
+      <w:r>
+        <w:rPr>
+          <w:lang w:val="pt-BR"/>
+        </w:rPr>
+        <w:t>Topik apa saja yang dibahas dalam</w:t>
+      </w:r>
+      <w:r>
+        <w:rPr>
+          <w:lang w:val="pt-BR"/>
+        </w:rPr>
+        <w:t xml:space="preserve"> komentar pengguna</w:t>
+      </w:r>
+    </w:p>
+    <w:p>
+      <w:pPr>
+        <w:pStyle w:val="ListParagraph"/>
+        <w:numPr>
+          <w:ilvl w:val="0"/>
+          <w:numId w:val="4"/>
+        </w:numPr>
+        <w:rPr>
+          <w:lang w:val="pt-BR"/>
+        </w:rPr>
+      </w:pPr>
+      <w:r>
+        <w:rPr>
+          <w:lang w:val="pt-BR"/>
+        </w:rPr>
+        <w:t>Mengetahui</w:t>
+      </w:r>
+      <w:r>
+        <w:rPr>
+          <w:lang w:val="pt-BR"/>
+        </w:rPr>
+        <w:t xml:space="preserve"> distribusi sentimen pada masing2 topik</w:t>
+      </w:r>
+    </w:p>
+    <w:p>
+      <w:pPr>
+        <w:pStyle w:val="ListParagraph"/>
+        <w:numPr>
+          <w:ilvl w:val="0"/>
+          <w:numId w:val="4"/>
+        </w:numPr>
+        <w:rPr>
+          <w:lang w:val="pt-BR"/>
+        </w:rPr>
+      </w:pPr>
+      <w:r>
+        <w:rPr>
+          <w:lang w:val="pt-BR"/>
+        </w:rPr>
+        <w:t xml:space="preserve">Melihat </w:t>
+      </w:r>
+      <w:r>
+        <w:t>a</w:t>
+      </w:r>
+      <w:r>
+        <w:t>pakah terdapat pola korelasi tertentu dengan sen</w:t>
+      </w:r>
+      <w:r>
+        <w:t>timen</w:t>
+      </w:r>
+    </w:p>
+    <w:p>
+      <w:pPr>
+        <w:pStyle w:val="ListParagraph"/>
+        <w:numPr>
+          <w:ilvl w:val="0"/>
+          <w:numId w:val="4"/>
+        </w:numPr>
+        <w:rPr>
+          <w:lang w:val="pt-BR"/>
+        </w:rPr>
+      </w:pPr>
+      <w:r>
+        <w:rPr>
+          <w:lang w:val="pt-BR"/>
+        </w:rPr>
+        <w:t xml:space="preserve">Membuat visualisasi </w:t>
+      </w:r>
+      <w:r>
+        <w:t>hasil analisis ini dalam dashboard in</w:t>
+      </w:r>
+      <w:r>
+        <w:t>teraktif</w:t>
+      </w:r>
     </w:p>
     <w:p>
       <w:r>
@@ -328,11 +439,13 @@
         </w:numPr>
       </w:pPr>
       <w:r>
-        <w:t xml:space="preserve">Translate API </w:t>
-      </w:r>
-      <w:r>
-        <w:t>GCP</w:t>
-      </w:r>
+        <w:t>Deploy: Streamlit</w:t>
+      </w:r>
+    </w:p>
+    <w:p>
+      <w:pPr>
+        <w:pStyle w:val="ListParagraph"/>
+      </w:pPr>
     </w:p>
     <w:p>
       <w:pPr>
@@ -343,13 +456,11 @@
         </w:numPr>
       </w:pPr>
       <w:r>
-        <w:t>Deploy: Streamlit</w:t>
-      </w:r>
-    </w:p>
-    <w:p>
-      <w:pPr>
-        <w:pStyle w:val="ListParagraph"/>
-      </w:pPr>
+        <w:t xml:space="preserve">Topic modelling: </w:t>
+      </w:r>
+      <w:r>
+        <w:t>LDA</w:t>
+      </w:r>
     </w:p>
     <w:p>
       <w:pPr>
@@ -360,7 +471,10 @@
         </w:numPr>
       </w:pPr>
       <w:r>
-        <w:t>Topic modelling: BERTopic + Gemma 2 topic modeling (dirty keywords on each topic interpreted automatically)</w:t>
+        <w:t xml:space="preserve">Sentimen label: </w:t>
+      </w:r>
+      <w:r>
+        <w:t>ROBERTA</w:t>
       </w:r>
     </w:p>
     <w:p>
@@ -372,19 +486,10 @@
         </w:numPr>
       </w:pPr>
       <w:r>
-        <w:t>Sentimen label: dialogflow</w:t>
-      </w:r>
-    </w:p>
-    <w:p>
-      <w:pPr>
-        <w:pStyle w:val="ListParagraph"/>
-        <w:numPr>
-          <w:ilvl w:val="0"/>
-          <w:numId w:val="1"/>
-        </w:numPr>
-      </w:pPr>
-      <w:r>
-        <w:t>Emotion label: gemma 2</w:t>
+        <w:t xml:space="preserve">Emotion label: </w:t>
+      </w:r>
+      <w:r>
+        <w:t>BERT</w:t>
       </w:r>
     </w:p>
     <w:p>
@@ -435,7 +540,6 @@
     <w:p/>
     <w:p>
       <w:r>
-        <w:lastRenderedPageBreak/>
         <w:t xml:space="preserve">Output: </w:t>
       </w:r>
     </w:p>

</xml_diff>